<commit_message>
rename starter kit package
</commit_message>
<xml_diff>
--- a/LoomQ-赛题.docx
+++ b/LoomQ-赛题.docx
@@ -1632,7 +1632,7 @@
         <w:rPr>
           <w:rStyle w:val="VerbatimChar"/>
         </w:rPr>
-        <w:t xml:space="preserve">starter-kit/adapter.py</w:t>
+        <w:t xml:space="preserve">starter_kit/adapter.py</w:t>
       </w:r>
       <w:r>
         <w:t xml:space="preserve"> </w:t>
@@ -2681,7 +2681,7 @@
           <w:b/>
           <w:bCs/>
         </w:rPr>
-        <w:t xml:space="preserve">starter-kit/</w:t>
+        <w:t xml:space="preserve">starter_kit/</w:t>
       </w:r>
       <w:r>
         <w:rPr>
@@ -2711,7 +2711,7 @@
         <w:rPr>
           <w:rStyle w:val="VerbatimChar"/>
         </w:rPr>
-        <w:t xml:space="preserve">starter-kit/submission.yaml</w:t>
+        <w:t xml:space="preserve">starter_kit/submission.yaml</w:t>
       </w:r>
       <w:r>
         <w:rPr>
@@ -2726,7 +2726,7 @@
         <w:rPr>
           <w:rStyle w:val="VerbatimChar"/>
         </w:rPr>
-        <w:t xml:space="preserve">starter-kit/adapter.py</w:t>
+        <w:t xml:space="preserve">starter_kit/adapter.py</w:t>
       </w:r>
       <w:r>
         <w:t xml:space="preserve">。</w:t>
@@ -4086,7 +4086,7 @@
         <w:rPr>
           <w:rStyle w:val="VerbatimChar"/>
         </w:rPr>
-        <w:t xml:space="preserve">python3 starter-kit/prepare_submission.py --team-id &lt;TEAM_ID&gt;</w:t>
+        <w:t xml:space="preserve">python3 starter_kit/prepare_submission.py --team-id &lt;TEAM_ID&gt;</w:t>
       </w:r>
       <w:r>
         <w:rPr>

</xml_diff>